<commit_message>
fix(parrillero-2.2): ronda de arreglos de la revisión final (4 mayores, 12 menores) + comida testigo del checklist del Paellero 2.2
- Comida testigo en TODOS los eventos: RD 1086/2020 art. 30.8.d («para eventos, cuando esta sea la
  actividad principal de la empresa»), verificado en el BOE consolidado; el «más de 40 personas» es el
  30.8.e. El checklist del Paellero 2.2 LIVE lo decía como condición doble: corregido y regenerado
  (cifras_caso_es.json idéntico).
- Tabla de cocción del manual y carta alineadas con la regla de 70 °C / «poco hecho» a petición;
  boda de ejemplo sin show de fuego (sigue a 42 €); landing con el escalado real (40-300 invitados).
- Ninguna cifra del caso movida. Gates verdes; Mac = VPS en los 13 ficheros.

Via: Claude Code
Co-Authored-By: Claude Opus 5.5 <noreply@anthropic.com>
</commit_message>
<xml_diff>
--- a/astro-site/public/dl/plan-negocio-parrillero-asador-eventos/carta-12-cortes-carne.docx
+++ b/astro-site/public/dl/plan-negocio-parrillero-asador-eventos/carta-12-cortes-carne.docx
@@ -42,7 +42,7 @@
         <w:spacing w:after="160"/>
       </w:pPr>
       <w:r>
-        <w:t>Esta carta es la base operativa para definir tus menús de evento. Cada corte incluye: descripción técnica, técnica de cocción recomendada, temperatura interna objetivo, ratio merma estimado, presentación recomendada y maridaje. Combina cortes según el concepto del evento (asado argentino, mediterráneo, castellano, BBQ texano, mix premium).</w:t>
+        <w:t>Esta carta es la base operativa para definir tus menús de evento. Cada corte incluye: descripción técnica, técnica de cocción recomendada, temperatura interna objetivo, ratio merma estimado, presentación recomendada y maridaje. Combina cortes según el concepto del evento (asado argentino, mediterráneo, castellano, BBQ texano, mix premium). Los objetivos por debajo de 70 °C son el punto «poco hecho»: solo en piezas enteras e intactas de vacuno o cordero y a petición del invitado. Cerdo, aves, picada y embutido, a 70 °C en el centro (74 °C las aves; recomendación de AESAN).</w:t>
       </w:r>
     </w:p>
     <w:p>
@@ -733,7 +733,7 @@
                 <w:color w:val="1F1B16"/>
                 <w:sz w:val="20"/>
               </w:rPr>
-              <w:t>60 °C, jamás bien hecho.</w:t>
+              <w:t>60 °C a petición; 70 °C por defecto.</w:t>
             </w:r>
           </w:p>
         </w:tc>

</xml_diff>